<commit_message>
Format problem 3 references
</commit_message>
<xml_diff>
--- a/reports/paper/docx/p3.docx
+++ b/reports/paper/docx/p3.docx
@@ -6757,7 +6757,7 @@
         <w:jc w:val="left"/>
       </w:pPr>
       <w:r>
-        <w:t xml:space="preserve">[1]World Bank.World Development Indicators(WDI)[DB/OL].https://databank.worldbank.org/source/world-development-indicators.</w:t>
+        <w:t>[1] Institute for Health Metrics and Evaluation. Global Burden of Disease Results Tool[DB/OL]. Seattle: IHME, 2024[2026-04-21]. https://vizhub.healthdata.org/gbd-results/.</w:t>
       </w:r>
     </w:p>
     <w:p>
@@ -6766,7 +6766,7 @@
         <w:jc w:val="left"/>
       </w:pPr>
       <w:r>
-        <w:t xml:space="preserve">[2]Institute for Health Metrics and Evaluation.Global Burden of Disease Study 2019(GBD2019)Results[DB/OL].https://www.healthdata.org/gbd.</w:t>
+        <w:t>[2] World Bank. World Development Indicators[DB/OL]. Washington, DC: World Bank, 2024[2026-04-21]. https://databank.worldbank.org/source/world-development-indicators.</w:t>
       </w:r>
     </w:p>
     <w:p>
@@ -6775,7 +6775,7 @@
         <w:jc w:val="left"/>
       </w:pPr>
       <w:r>
-        <w:t xml:space="preserve">[3]World Health Organization.World health statistics 2023:monitoring health for the SDGs,sustainable development goals[M].Geneva:WHO,2023.</w:t>
+        <w:t>[3] World Bank. Health Nutrition and Population Statistics[DB/OL]. Washington, DC: World Bank, 2024[2026-04-21]. https://databank.worldbank.org/source/health-nutrition-and-population-statistics.</w:t>
       </w:r>
     </w:p>
     <w:p>
@@ -6784,7 +6784,7 @@
         <w:jc w:val="left"/>
       </w:pPr>
       <w:r>
-        <w:t xml:space="preserve">[4]Rawls J.A Theory of Justice[M].Cambridge,MA:Harvard University Press,1971.</w:t>
+        <w:t>[4] 国家统计局. 中国统计年鉴[DB/OL]. 北京: 中国统计出版社, 2024[2026-04-21]. https://www.stats.gov.cn/sj/ndsj/.</w:t>
       </w:r>
     </w:p>
     <w:p>
@@ -6793,7 +6793,7 @@
         <w:jc w:val="left"/>
       </w:pPr>
       <w:r>
-        <w:t xml:space="preserve">[5]国家统计局.中国统计年鉴与卫生统计年鉴相关年度数据[DB/OL].</w:t>
+        <w:t>[5] Rawls J. A Theory of Justice[M]. Cambridge, MA: Harvard University Press, 1971.</w:t>
       </w:r>
     </w:p>
     <w:bookmarkEnd w:id="37"/>

</xml_diff>